<commit_message>
chore: update README with live demo link and refresh resume files
Updated the README to include the live demo URL for the portfolio. Also, modified the resume files in both DOCX and PDF formats to ensure they are current.
</commit_message>
<xml_diff>
--- a/backend/public/assets/resume.docx
+++ b/backend/public/assets/resume.docx
@@ -12,29 +12,14 @@
     </w:p>
     <w:p>
       <w:r>
-        <w:t>Durgapur</w:t>
-      </w:r>
-      <w:r>
-        <w:t xml:space="preserve">, West Bengal | +91 </w:t>
-      </w:r>
-      <w:r>
-        <w:t>9679885493</w:t>
-      </w:r>
-      <w:r>
-        <w:t xml:space="preserve"> | </w:t>
+        <w:t xml:space="preserve">Durgapur, West Bengal | +91 9679885493 | </w:t>
       </w:r>
       <w:hyperlink r:id="rId6" w:history="1">
         <w:r>
           <w:rPr>
             <w:rStyle w:val="Hyperlink"/>
           </w:rPr>
-          <w:t>rebagarai83</w:t>
-        </w:r>
-        <w:r>
-          <w:rPr>
-            <w:rStyle w:val="Hyperlink"/>
-          </w:rPr>
-          <w:t>@gmail.com</w:t>
+          <w:t>rebagarai83@gmail.com</w:t>
         </w:r>
       </w:hyperlink>
     </w:p>
@@ -58,7 +43,19 @@
           <w:rPr>
             <w:rStyle w:val="Hyperlink"/>
           </w:rPr>
-          <w:t>https://sayan21m.github.io/portfolio/</w:t>
+          <w:t>https://portfolio-d</w:t>
+        </w:r>
+        <w:r>
+          <w:rPr>
+            <w:rStyle w:val="Hyperlink"/>
+          </w:rPr>
+          <w:t>v</w:t>
+        </w:r>
+        <w:r>
+          <w:rPr>
+            <w:rStyle w:val="Hyperlink"/>
+          </w:rPr>
+          <w:t>ey.onrender.com</w:t>
         </w:r>
       </w:hyperlink>
       <w:r>
@@ -11826,6 +11823,18 @@
       <w:shd w:val="clear" w:color="auto" w:fill="E1DFDD"/>
     </w:rPr>
   </w:style>
+  <w:style w:type="character" w:styleId="FollowedHyperlink">
+    <w:name w:val="FollowedHyperlink"/>
+    <w:basedOn w:val="DefaultParagraphFont"/>
+    <w:uiPriority w:val="99"/>
+    <w:semiHidden/>
+    <w:unhideWhenUsed/>
+    <w:rsid w:val="003A4D3F"/>
+    <w:rPr>
+      <w:color w:val="800080" w:themeColor="followedHyperlink"/>
+      <w:u w:val="single"/>
+    </w:rPr>
+  </w:style>
 </w:styles>
 </file>
 

</xml_diff>

<commit_message>
refactor: remove 'Currently Learning' section and related navigation
Eliminated the 'Currently Learning' section from the homepage and navigation, streamlining the content. Updated the README to reflect the removal of roadmap cards. Enhanced the resume with updated SGPA details for semesters 1 through 4 and overall YGPA for the first two years.
</commit_message>
<xml_diff>
--- a/backend/public/assets/resume.docx
+++ b/backend/public/assets/resume.docx
@@ -94,19 +94,16 @@
     <w:p>
       <w:r>
         <w:t>MCKV Institute of Engineering</w:t>
-      </w:r>
-      <w:r>
         <w:br/>
         <w:t>Bachelor of Technology (B.Tech), Information Technology</w:t>
-      </w:r>
-      <w:r>
         <w:br/>
         <w:t>Expected Graduation: 2028</w:t>
+        <w:br/>
+        <w:t>Semester 1: 8.76 | Semester 2: 9.20 | Year 1 YGPA: 8.97 | Semester 3: 9.78 | Semester 4: 9.73 | Year 2 YGPA: 9.75</w:t>
       </w:r>
-      <w:r>
-        <w:br/>
-        <w:t>Semester 1: 8.76 | Semester 2: 9.22 | Year 1 YGPA: 8.97 | Semester 3: 9.78</w:t>
-      </w:r>
+      <w:r/>
+      <w:r/>
+      <w:r/>
     </w:p>
     <w:p>
       <w:pPr>

</xml_diff>

<commit_message>
chore: update README with new live demo link and add portfolio URL to resume
Replaced the live demo link in the README with the updated URL. Added the portfolio link to the resume text file for better visibility. Updated PDF resume metadata to reflect recent changes.
</commit_message>
<xml_diff>
--- a/backend/public/assets/resume.docx
+++ b/backend/public/assets/resume.docx
@@ -25,7 +25,7 @@
     </w:p>
     <w:p>
       <w:r>
-        <w:t xml:space="preserve">GitHub: </w:t>
+        <w:t>GitHub: github.com/sayan21m | Portfolio: https://portfolio-backend-seven-azure.vercel.app | LinkedIn: https://www.linkedin.com/in/sayan-garai-8b6246370</w:t>
       </w:r>
       <w:hyperlink r:id="rId7" w:history="1">
         <w:r>
@@ -35,9 +35,7 @@
           <w:t>github.com/sayan21m</w:t>
         </w:r>
       </w:hyperlink>
-      <w:r>
-        <w:t xml:space="preserve"> | Portfolio: </w:t>
-      </w:r>
+      <w:r/>
       <w:hyperlink r:id="rId8" w:history="1">
         <w:r>
           <w:rPr>
@@ -58,9 +56,7 @@
           <w:t>ey.onrender.com</w:t>
         </w:r>
       </w:hyperlink>
-      <w:r>
-        <w:t xml:space="preserve"> | LinkedIn: </w:t>
-      </w:r>
+      <w:r/>
       <w:hyperlink r:id="rId9" w:history="1">
         <w:r>
           <w:rPr>

</xml_diff>

<commit_message>
chore: update resume details and metadata
Enhanced the resume text file with updated educational information, including institution names and percentages for Class XII and Class X. Adjusted SGPA for Semester II in the home view and updated PDF metadata to reflect the latest changes.
</commit_message>
<xml_diff>
--- a/backend/public/assets/resume.docx
+++ b/backend/public/assets/resume.docx
@@ -27,44 +27,6 @@
       <w:r>
         <w:t>GitHub: github.com/sayan21m | Portfolio: https://portfolio-backend-seven-azure.vercel.app | LinkedIn: https://www.linkedin.com/in/sayan-garai-8b6246370</w:t>
       </w:r>
-      <w:hyperlink r:id="rId7" w:history="1">
-        <w:r>
-          <w:rPr>
-            <w:rStyle w:val="Hyperlink"/>
-          </w:rPr>
-          <w:t>github.com/sayan21m</w:t>
-        </w:r>
-      </w:hyperlink>
-      <w:r/>
-      <w:hyperlink r:id="rId8" w:history="1">
-        <w:r>
-          <w:rPr>
-            <w:rStyle w:val="Hyperlink"/>
-          </w:rPr>
-          <w:t>https://portfolio-d</w:t>
-        </w:r>
-        <w:r>
-          <w:rPr>
-            <w:rStyle w:val="Hyperlink"/>
-          </w:rPr>
-          <w:t>v</w:t>
-        </w:r>
-        <w:r>
-          <w:rPr>
-            <w:rStyle w:val="Hyperlink"/>
-          </w:rPr>
-          <w:t>ey.onrender.com</w:t>
-        </w:r>
-      </w:hyperlink>
-      <w:r/>
-      <w:hyperlink r:id="rId9" w:history="1">
-        <w:r>
-          <w:rPr>
-            <w:rStyle w:val="Hyperlink"/>
-          </w:rPr>
-          <w:t>https://www.linkedin.com/in/sayan-garai-8b6246370</w:t>
-        </w:r>
-      </w:hyperlink>
     </w:p>
     <w:p>
       <w:pPr>
@@ -95,11 +57,18 @@
         <w:br/>
         <w:t>Expected Graduation: 2028</w:t>
         <w:br/>
-        <w:t>Semester 1: 8.76 | Semester 2: 9.20 | Year 1 YGPA: 8.97 | Semester 3: 9.78 | Semester 4: 9.73 | Year 2 YGPA: 9.75</w:t>
+        <w:t>Semester 1: 8.76 | Semester 2: 9.22 | Year 1 YGPA: 8.97 | Semester 3: 9.78 | Semester 4: 9.73 | Year 2 YGPA: 9.75</w:t>
+        <w:br/>
+        <w:br/>
+        <w:t>Class XII — Peariganj Charuchandra High School | WBCHSE | 2023</w:t>
+        <w:br/>
+        <w:t>Percentage: 73%</w:t>
+        <w:br/>
+        <w:br/>
+        <w:t>Class X — Sri Ramakrishna Sevashram Vidyapith (Domra) | WBBSE | 2021</w:t>
+        <w:br/>
+        <w:t>Percentage: 95.4%</w:t>
       </w:r>
-      <w:r/>
-      <w:r/>
-      <w:r/>
     </w:p>
     <w:p>
       <w:pPr>
@@ -174,6 +143,22 @@
     </w:p>
     <w:p>
       <w:pPr>
+        <w:pStyle w:val="Heading2"/>
+      </w:pPr>
+      <w:r>
+        <w:t>Fire Before Fire – ESP32 Early Electrical Fire-Risk Detection</w:t>
+      </w:r>
+    </w:p>
+    <w:p>
+      <w:pPr/>
+      <w:r>
+        <w:t>Tech: ESP32, C++, PlatformIO, ACS712, DS18B20, Gaussian NB, Softmax LR, Node.js, Express, Web Push</w:t>
+        <w:br/>
+        <w:t>• Built an ESP32 early electrical heating and fire-risk detection system with SoftAP dashboard, on-device GNB + logistic regression ensemble, and cloud model sync.</w:t>
+      </w:r>
+    </w:p>
+    <w:p>
+      <w:pPr>
         <w:pStyle w:val="Heading1"/>
       </w:pPr>
       <w:r>
@@ -194,6 +179,20 @@
       <w:r>
         <w:br/>
         <w:t>• Smart India Hackathon (SIH) – Cleared College Level</w:t>
+      </w:r>
+    </w:p>
+    <w:p>
+      <w:pPr>
+        <w:pStyle w:val="Heading1"/>
+      </w:pPr>
+      <w:r>
+        <w:t>DECLARATION</w:t>
+      </w:r>
+    </w:p>
+    <w:p>
+      <w:pPr/>
+      <w:r>
+        <w:t>I hereby declare that the information provided above is true and correct to the best of my knowledge and belief.</w:t>
       </w:r>
     </w:p>
     <w:sectPr>

</xml_diff>